<commit_message>
Aggiunge conservazione a norma dei log amministratori di sistema (Provv. Garante 27/11/2008)
- agent.ini: admin_log_files/admin_event_logs con tag log_class=admin-access
- provision-admin-log-stream.sh: stream+index set dedicati, retention >=6 mesi
- seal-admin-logs.sh: hash chain giornaliera + marca temporale RFC3161
- verify-admin-log-seal.sh: verifica catena, rileva manomissioni (testato)
- guida installazione, documento ISO tecnico e template organizzativo aggiornati
</commit_message>
<xml_diff>
--- a/manuali/iso27001-politiche-organizzative.docx
+++ b/manuali/iso27001-politiche-organizzative.docx
@@ -242,6 +242,19 @@
         <w:t xml:space="preserve">Da compilare con i nominativi reali (A.5.2).</w:t>
       </w:r>
     </w:p>
+    <w:p>
+      <w:pPr>
+        <w:spacing w:after="200"/>
+      </w:pPr>
+      <w:r>
+        <w:rPr>
+          <w:i/>
+          <w:iCs/>
+          <w:color w:val="555555"/>
+        </w:rPr>
+        <w:t xml:space="preserve">Nota: il Provvedimento Garante Privacy 27/11/2008 richiede un elenco nominativo degli amministratori di sistema, riesaminato almeno annualmente, e la conservazione dei loro log di accesso per almeno 6 mesi con garanzia di non alterabilità. La parte tecnica è coperta da scripts/provision-admin-log-stream.sh e scripts/seal-admin-logs.sh (vedi iso27001-log-platform.pdf) — qui va tracciato l'elenco nominativo.</w:t>
+      </w:r>
+    </w:p>
     <w:tbl>
       <w:tblPr>
         <w:tblW w:type="dxa" w:w="9000"/>
@@ -470,6 +483,153 @@
         <w:tc>
           <w:tcPr>
             <w:tcW w:type="dxa" w:w="2000"/>
+          </w:tcPr>
+          <w:p>
+            <w:r>
+              <w:rPr>
+                <w:b w:val="false"/>
+                <w:bCs w:val="false"/>
+              </w:rPr>
+              <w:t xml:space="preserve">________________</w:t>
+            </w:r>
+          </w:p>
+        </w:tc>
+      </w:tr>
+    </w:tbl>
+    <w:p>
+      <w:pPr>
+        <w:pStyle w:val="Heading2"/>
+      </w:pPr>
+      <w:r>
+        <w:t xml:space="preserve">2.1 Elenco Amministratori di Sistema (art. 2, Provv. Garante 27/11/2008)</w:t>
+      </w:r>
+    </w:p>
+    <w:tbl>
+      <w:tblPr>
+        <w:tblW w:type="dxa" w:w="9000"/>
+        <w:tblBorders>
+          <w:top w:val="single" w:color="auto" w:sz="4"/>
+          <w:left w:val="single" w:color="auto" w:sz="4"/>
+          <w:bottom w:val="single" w:color="auto" w:sz="4"/>
+          <w:right w:val="single" w:color="auto" w:sz="4"/>
+          <w:insideH w:val="single" w:color="auto" w:sz="4"/>
+          <w:insideV w:val="single" w:color="auto" w:sz="4"/>
+        </w:tblBorders>
+      </w:tblPr>
+      <w:tblGrid>
+        <w:gridCol w:w="2300"/>
+        <w:gridCol w:w="2300"/>
+        <w:gridCol w:w="2200"/>
+        <w:gridCol w:w="2200"/>
+      </w:tblGrid>
+      <w:tr>
+        <w:tc>
+          <w:tcPr>
+            <w:tcW w:type="dxa" w:w="2300"/>
+            <w:shd w:fill="D9E2F3" w:val="clear"/>
+          </w:tcPr>
+          <w:p>
+            <w:r>
+              <w:rPr>
+                <w:b/>
+                <w:bCs/>
+              </w:rPr>
+              <w:t xml:space="preserve">Nominativo</w:t>
+            </w:r>
+          </w:p>
+        </w:tc>
+        <w:tc>
+          <w:tcPr>
+            <w:tcW w:type="dxa" w:w="2300"/>
+            <w:shd w:fill="D9E2F3" w:val="clear"/>
+          </w:tcPr>
+          <w:p>
+            <w:r>
+              <w:rPr>
+                <w:b/>
+                <w:bCs/>
+              </w:rPr>
+              <w:t xml:space="preserve">Ambito di competenza</w:t>
+            </w:r>
+          </w:p>
+        </w:tc>
+        <w:tc>
+          <w:tcPr>
+            <w:tcW w:type="dxa" w:w="2200"/>
+            <w:shd w:fill="D9E2F3" w:val="clear"/>
+          </w:tcPr>
+          <w:p>
+            <w:r>
+              <w:rPr>
+                <w:b/>
+                <w:bCs/>
+              </w:rPr>
+              <w:t xml:space="preserve">Data nomina</w:t>
+            </w:r>
+          </w:p>
+        </w:tc>
+        <w:tc>
+          <w:tcPr>
+            <w:tcW w:type="dxa" w:w="2200"/>
+            <w:shd w:fill="D9E2F3" w:val="clear"/>
+          </w:tcPr>
+          <w:p>
+            <w:r>
+              <w:rPr>
+                <w:b/>
+                <w:bCs/>
+              </w:rPr>
+              <w:t xml:space="preserve">Ultimo riesame annuale</w:t>
+            </w:r>
+          </w:p>
+        </w:tc>
+      </w:tr>
+      <w:tr>
+        <w:tc>
+          <w:tcPr>
+            <w:tcW w:type="dxa" w:w="2300"/>
+          </w:tcPr>
+          <w:p>
+            <w:r>
+              <w:rPr>
+                <w:b w:val="false"/>
+                <w:bCs w:val="false"/>
+              </w:rPr>
+              <w:t xml:space="preserve">________________</w:t>
+            </w:r>
+          </w:p>
+        </w:tc>
+        <w:tc>
+          <w:tcPr>
+            <w:tcW w:type="dxa" w:w="2300"/>
+          </w:tcPr>
+          <w:p>
+            <w:r>
+              <w:rPr>
+                <w:b w:val="false"/>
+                <w:bCs w:val="false"/>
+              </w:rPr>
+              <w:t xml:space="preserve">________________</w:t>
+            </w:r>
+          </w:p>
+        </w:tc>
+        <w:tc>
+          <w:tcPr>
+            <w:tcW w:type="dxa" w:w="2200"/>
+          </w:tcPr>
+          <w:p>
+            <w:r>
+              <w:rPr>
+                <w:b w:val="false"/>
+                <w:bCs w:val="false"/>
+              </w:rPr>
+              <w:t xml:space="preserve">________________</w:t>
+            </w:r>
+          </w:p>
+        </w:tc>
+        <w:tc>
+          <w:tcPr>
+            <w:tcW w:type="dxa" w:w="2200"/>
           </w:tcPr>
           <w:p>
             <w:r>

</xml_diff>